<commit_message>
Devis: corriger le gabarit PDF V2
</commit_message>
<xml_diff>
--- a/docs/templates/PAPOT_Template_Devis_V2.docx
+++ b/docs/templates/PAPOT_Template_Devis_V2.docx
@@ -1,6 +1,6 @@
 
 <file path=word/document.xml><?xml version="1.0" encoding="utf-8"?>
-<w:document xmlns:wpc="http://schemas.microsoft.com/office/word/2010/wordprocessingCanvas" xmlns:mo="http://schemas.microsoft.com/office/mac/office/2008/main" xmlns:mc="http://schemas.openxmlformats.org/markup-compatibility/2006" xmlns:mv="urn:schemas-microsoft-com:mac:vml" xmlns:o="urn:schemas-microsoft-com:office:office" xmlns:r="http://schemas.openxmlformats.org/officeDocument/2006/relationships" xmlns:m="http://schemas.openxmlformats.org/officeDocument/2006/math" xmlns:v="urn:schemas-microsoft-com:vml" xmlns:wp14="http://schemas.microsoft.com/office/word/2010/wordprocessingDrawing" xmlns:wp="http://schemas.openxmlformats.org/drawingml/2006/wordprocessingDrawing" xmlns:w10="urn:schemas-microsoft-com:office:word" xmlns:w="http://schemas.openxmlformats.org/wordprocessingml/2006/main" xmlns:w14="http://schemas.microsoft.com/office/word/2010/wordml" xmlns:wpg="http://schemas.microsoft.com/office/word/2010/wordprocessingGroup" xmlns:wpi="http://schemas.microsoft.com/office/word/2010/wordprocessingInk" xmlns:wne="http://schemas.microsoft.com/office/word/2006/wordml" xmlns:wps="http://schemas.microsoft.com/office/word/2010/wordprocessingShape" mc:Ignorable="w14 wp14">
+<w:document xmlns:ns1="http://schemas.openxmlformats.org/markup-compatibility/2006" xmlns:ns2="http://schemas.openxmlformats.org/drawingml/2006/wordprocessingDrawing" xmlns:ns3="http://schemas.openxmlformats.org/drawingml/2006/main" xmlns:ns4="http://schemas.openxmlformats.org/drawingml/2006/picture" xmlns:ns5="http://schemas.openxmlformats.org/officeDocument/2006/relationships" xmlns:w="http://schemas.openxmlformats.org/wordprocessingml/2006/main" ns1:Ignorable="w14 wp14">
   <w:body>
     <w:tbl>
       <w:tblPr>
@@ -41,36 +41,36 @@
             </w:pPr>
             <w:r>
               <w:drawing>
-                <wp:inline xmlns:a="http://schemas.openxmlformats.org/drawingml/2006/main" xmlns:pic="http://schemas.openxmlformats.org/drawingml/2006/picture">
-                  <wp:extent cx="1152000" cy="1040065"/>
-                  <wp:docPr id="1" name="Picture 1"/>
-                  <wp:cNvGraphicFramePr>
-                    <a:graphicFrameLocks noChangeAspect="1"/>
-                  </wp:cNvGraphicFramePr>
-                  <a:graphic>
-                    <a:graphicData uri="http://schemas.openxmlformats.org/drawingml/2006/picture">
-                      <pic:pic>
-                        <pic:nvPicPr>
-                          <pic:cNvPr id="0" name="papot_quote_logo_v2.png"/>
-                          <pic:cNvPicPr/>
-                        </pic:nvPicPr>
-                        <pic:blipFill>
-                          <a:blip r:embed="rId9"/>
-                          <a:stretch>
-                            <a:fillRect/>
-                          </a:stretch>
-                        </pic:blipFill>
-                        <pic:spPr>
-                          <a:xfrm>
-                            <a:off x="0" y="0"/>
-                            <a:ext cx="1152000" cy="1040065"/>
-                          </a:xfrm>
-                          <a:prstGeom prst="rect"/>
-                        </pic:spPr>
-                      </pic:pic>
-                    </a:graphicData>
-                  </a:graphic>
-                </wp:inline>
+                <ns2:inline>
+                  <ns2:extent cx="1152000" cy="1040065"/>
+                  <ns2:docPr id="1" name="Picture 1"/>
+                  <ns2:cNvGraphicFramePr>
+                    <ns3:graphicFrameLocks noChangeAspect="1"/>
+                  </ns2:cNvGraphicFramePr>
+                  <ns3:graphic>
+                    <ns3:graphicData uri="http://schemas.openxmlformats.org/drawingml/2006/picture">
+                      <ns4:pic>
+                        <ns4:nvPicPr>
+                          <ns4:cNvPr id="0" name="papot_quote_logo_v2.png"/>
+                          <ns4:cNvPicPr/>
+                        </ns4:nvPicPr>
+                        <ns4:blipFill>
+                          <ns3:blip ns5:embed="rId9"/>
+                          <ns3:stretch>
+                            <ns3:fillRect/>
+                          </ns3:stretch>
+                        </ns4:blipFill>
+                        <ns4:spPr>
+                          <ns3:xfrm>
+                            <ns3:off x="0" y="0"/>
+                            <ns3:ext cx="1152000" cy="1040065"/>
+                          </ns3:xfrm>
+                          <ns3:prstGeom prst="rect"/>
+                        </ns4:spPr>
+                      </ns4:pic>
+                    </ns3:graphicData>
+                  </ns3:graphic>
+                </ns2:inline>
               </w:drawing>
             </w:r>
           </w:p>
@@ -478,18 +478,18 @@
     </w:p>
     <w:tbl>
       <w:tblPr>
-        <w:tblW w:type="auto" w:w="0"/>
+        <w:tblW w:type="dxa" w:w="10998"/>
         <w:jc w:val="center"/>
         <w:tblLayout w:type="fixed"/>
         <w:tblLook w:firstColumn="1" w:firstRow="1" w:lastColumn="0" w:lastRow="0" w:noHBand="0" w:noVBand="1" w:val="04A0"/>
       </w:tblPr>
       <w:tblGrid>
-        <w:gridCol w:w="1833"/>
-        <w:gridCol w:w="1833"/>
-        <w:gridCol w:w="1833"/>
-        <w:gridCol w:w="1833"/>
-        <w:gridCol w:w="1833"/>
-        <w:gridCol w:w="1833"/>
+        <w:gridCol w:w="567"/>
+        <w:gridCol w:w="5216"/>
+        <w:gridCol w:w="1134"/>
+        <w:gridCol w:w="1417"/>
+        <w:gridCol w:w="1077"/>
+        <w:gridCol w:w="1587"/>
       </w:tblGrid>
       <w:tr>
         <w:trPr>
@@ -808,36 +808,20 @@
         </w:tc>
       </w:tr>
     </w:tbl>
-    <w:p>
-      <w:pPr>
-        <w:keepNext/>
-        <w:spacing w:before="50" w:after="30" w:line="240" w:lineRule="auto"/>
-      </w:pPr>
-      <w:r>
-        <w:rPr>
-          <w:rFonts w:ascii="Arial" w:hAnsi="Arial"/>
-          <w:b/>
-          <w:i w:val="0"/>
-          <w:color w:val="555555"/>
-          <w:sz w:val="16"/>
-        </w:rPr>
-        <w:t>OPTIONS NON COMPRISES DANS LE TOTAL PRINCIPAL</w:t>
-      </w:r>
-    </w:p>
     <w:tbl>
       <w:tblPr>
-        <w:tblW w:type="auto" w:w="0"/>
+        <w:tblW w:type="dxa" w:w="10998"/>
         <w:jc w:val="center"/>
         <w:tblLayout w:type="fixed"/>
         <w:tblLook w:firstColumn="1" w:firstRow="1" w:lastColumn="0" w:lastRow="0" w:noHBand="0" w:noVBand="1" w:val="04A0"/>
       </w:tblPr>
       <w:tblGrid>
-        <w:gridCol w:w="1833"/>
-        <w:gridCol w:w="1833"/>
-        <w:gridCol w:w="1833"/>
-        <w:gridCol w:w="1833"/>
-        <w:gridCol w:w="1833"/>
-        <w:gridCol w:w="1833"/>
+        <w:gridCol w:w="567"/>
+        <w:gridCol w:w="5216"/>
+        <w:gridCol w:w="1134"/>
+        <w:gridCol w:w="1417"/>
+        <w:gridCol w:w="1077"/>
+        <w:gridCol w:w="1587"/>
       </w:tblGrid>
       <w:tr>
         <w:trPr>
@@ -1127,7 +1111,7 @@
     </w:tbl>
     <w:tbl>
       <w:tblPr>
-        <w:tblW w:type="auto" w:w="0"/>
+        <w:tblW w:type="dxa" w:w="10886"/>
         <w:jc w:val="center"/>
         <w:tblLayout w:type="fixed"/>
         <w:tblLook w:firstColumn="1" w:firstRow="1" w:lastColumn="0" w:lastRow="0" w:noHBand="0" w:noVBand="1" w:val="04A0"/>
@@ -1141,14 +1125,14 @@
         </w:tblBorders>
       </w:tblPr>
       <w:tblGrid>
-        <w:gridCol w:w="5499"/>
-        <w:gridCol w:w="5499"/>
+        <w:gridCol w:w="6314"/>
+        <w:gridCol w:w="4572"/>
       </w:tblGrid>
       <w:tr>
         <w:trPr/>
         <w:tc>
           <w:tcPr>
-            <w:tcW w:type="dxa" w:w="5443"/>
+            <w:tcW w:type="dxa" w:w="6314"/>
             <w:tcMar>
               <w:top w:w="80" w:type="dxa"/>
               <w:start w:w="0" w:type="dxa"/>
@@ -1312,7 +1296,7 @@
         </w:tc>
         <w:tc>
           <w:tcPr>
-            <w:tcW w:type="dxa" w:w="5443"/>
+            <w:tcW w:type="dxa" w:w="4572"/>
             <w:tcMar>
               <w:top w:w="80" w:type="dxa"/>
               <w:start w:w="0" w:type="dxa"/>
@@ -1654,6 +1638,14 @@
               <w:spacing w:after="0"/>
             </w:pPr>
           </w:p>
+        </w:tc>
+      </w:tr>
+      <w:tr>
+        <w:tc>
+          <w:tcPr>
+            <w:tcW w:type="dxa" w:w="10886"/>
+            <w:gridSpan w:val="2"/>
+          </w:tcPr>
           <w:p>
             <w:pPr>
               <w:spacing w:before="60" w:after="20" w:line="240" w:lineRule="auto"/>
@@ -2234,7 +2226,7 @@
       </w:r>
     </w:p>
     <w:sectPr>
-      <w:footerReference w:type="default" r:id="rId10"/>
+      <w:footerReference w:type="default" ns5:id="rId10"/>
       <w:pgSz w:w="11906" w:h="16838"/>
       <w:pgMar w:top="510" w:right="454" w:bottom="737" w:left="454" w:header="227" w:footer="283" w:gutter="0"/>
       <w:cols w:space="720"/>

</xml_diff>

<commit_message>
Devis: restaurer le gabarit binaire d origine
</commit_message>
<xml_diff>
--- a/docs/templates/PAPOT_Template_Devis_V2.docx
+++ b/docs/templates/PAPOT_Template_Devis_V2.docx
@@ -1,6 +1,6 @@
 
 <file path=word/document.xml><?xml version="1.0" encoding="utf-8"?>
-<w:document xmlns:ns1="http://schemas.openxmlformats.org/markup-compatibility/2006" xmlns:ns2="http://schemas.openxmlformats.org/drawingml/2006/wordprocessingDrawing" xmlns:ns3="http://schemas.openxmlformats.org/drawingml/2006/main" xmlns:ns4="http://schemas.openxmlformats.org/drawingml/2006/picture" xmlns:ns5="http://schemas.openxmlformats.org/officeDocument/2006/relationships" xmlns:w="http://schemas.openxmlformats.org/wordprocessingml/2006/main" ns1:Ignorable="w14 wp14">
+<w:document xmlns:wpc="http://schemas.microsoft.com/office/word/2010/wordprocessingCanvas" xmlns:mo="http://schemas.microsoft.com/office/mac/office/2008/main" xmlns:mc="http://schemas.openxmlformats.org/markup-compatibility/2006" xmlns:mv="urn:schemas-microsoft-com:mac:vml" xmlns:o="urn:schemas-microsoft-com:office:office" xmlns:r="http://schemas.openxmlformats.org/officeDocument/2006/relationships" xmlns:m="http://schemas.openxmlformats.org/officeDocument/2006/math" xmlns:v="urn:schemas-microsoft-com:vml" xmlns:wp14="http://schemas.microsoft.com/office/word/2010/wordprocessingDrawing" xmlns:wp="http://schemas.openxmlformats.org/drawingml/2006/wordprocessingDrawing" xmlns:w10="urn:schemas-microsoft-com:office:word" xmlns:w="http://schemas.openxmlformats.org/wordprocessingml/2006/main" xmlns:w14="http://schemas.microsoft.com/office/word/2010/wordml" xmlns:wpg="http://schemas.microsoft.com/office/word/2010/wordprocessingGroup" xmlns:wpi="http://schemas.microsoft.com/office/word/2010/wordprocessingInk" xmlns:wne="http://schemas.microsoft.com/office/word/2006/wordml" xmlns:wps="http://schemas.microsoft.com/office/word/2010/wordprocessingShape" mc:Ignorable="w14 wp14">
   <w:body>
     <w:tbl>
       <w:tblPr>
@@ -41,36 +41,36 @@
             </w:pPr>
             <w:r>
               <w:drawing>
-                <ns2:inline>
-                  <ns2:extent cx="1152000" cy="1040065"/>
-                  <ns2:docPr id="1" name="Picture 1"/>
-                  <ns2:cNvGraphicFramePr>
-                    <ns3:graphicFrameLocks noChangeAspect="1"/>
-                  </ns2:cNvGraphicFramePr>
-                  <ns3:graphic>
-                    <ns3:graphicData uri="http://schemas.openxmlformats.org/drawingml/2006/picture">
-                      <ns4:pic>
-                        <ns4:nvPicPr>
-                          <ns4:cNvPr id="0" name="papot_quote_logo_v2.png"/>
-                          <ns4:cNvPicPr/>
-                        </ns4:nvPicPr>
-                        <ns4:blipFill>
-                          <ns3:blip ns5:embed="rId9"/>
-                          <ns3:stretch>
-                            <ns3:fillRect/>
-                          </ns3:stretch>
-                        </ns4:blipFill>
-                        <ns4:spPr>
-                          <ns3:xfrm>
-                            <ns3:off x="0" y="0"/>
-                            <ns3:ext cx="1152000" cy="1040065"/>
-                          </ns3:xfrm>
-                          <ns3:prstGeom prst="rect"/>
-                        </ns4:spPr>
-                      </ns4:pic>
-                    </ns3:graphicData>
-                  </ns3:graphic>
-                </ns2:inline>
+                <wp:inline xmlns:a="http://schemas.openxmlformats.org/drawingml/2006/main" xmlns:pic="http://schemas.openxmlformats.org/drawingml/2006/picture">
+                  <wp:extent cx="1152000" cy="1040065"/>
+                  <wp:docPr id="1" name="Picture 1"/>
+                  <wp:cNvGraphicFramePr>
+                    <a:graphicFrameLocks noChangeAspect="1"/>
+                  </wp:cNvGraphicFramePr>
+                  <a:graphic>
+                    <a:graphicData uri="http://schemas.openxmlformats.org/drawingml/2006/picture">
+                      <pic:pic>
+                        <pic:nvPicPr>
+                          <pic:cNvPr id="0" name="papot_quote_logo_v2.png"/>
+                          <pic:cNvPicPr/>
+                        </pic:nvPicPr>
+                        <pic:blipFill>
+                          <a:blip r:embed="rId9"/>
+                          <a:stretch>
+                            <a:fillRect/>
+                          </a:stretch>
+                        </pic:blipFill>
+                        <pic:spPr>
+                          <a:xfrm>
+                            <a:off x="0" y="0"/>
+                            <a:ext cx="1152000" cy="1040065"/>
+                          </a:xfrm>
+                          <a:prstGeom prst="rect"/>
+                        </pic:spPr>
+                      </pic:pic>
+                    </a:graphicData>
+                  </a:graphic>
+                </wp:inline>
               </w:drawing>
             </w:r>
           </w:p>
@@ -478,18 +478,18 @@
     </w:p>
     <w:tbl>
       <w:tblPr>
-        <w:tblW w:type="dxa" w:w="10998"/>
+        <w:tblW w:type="auto" w:w="0"/>
         <w:jc w:val="center"/>
         <w:tblLayout w:type="fixed"/>
         <w:tblLook w:firstColumn="1" w:firstRow="1" w:lastColumn="0" w:lastRow="0" w:noHBand="0" w:noVBand="1" w:val="04A0"/>
       </w:tblPr>
       <w:tblGrid>
-        <w:gridCol w:w="567"/>
-        <w:gridCol w:w="5216"/>
-        <w:gridCol w:w="1134"/>
-        <w:gridCol w:w="1417"/>
-        <w:gridCol w:w="1077"/>
-        <w:gridCol w:w="1587"/>
+        <w:gridCol w:w="1833"/>
+        <w:gridCol w:w="1833"/>
+        <w:gridCol w:w="1833"/>
+        <w:gridCol w:w="1833"/>
+        <w:gridCol w:w="1833"/>
+        <w:gridCol w:w="1833"/>
       </w:tblGrid>
       <w:tr>
         <w:trPr>
@@ -808,20 +808,36 @@
         </w:tc>
       </w:tr>
     </w:tbl>
+    <w:p>
+      <w:pPr>
+        <w:keepNext/>
+        <w:spacing w:before="50" w:after="30" w:line="240" w:lineRule="auto"/>
+      </w:pPr>
+      <w:r>
+        <w:rPr>
+          <w:rFonts w:ascii="Arial" w:hAnsi="Arial"/>
+          <w:b/>
+          <w:i w:val="0"/>
+          <w:color w:val="555555"/>
+          <w:sz w:val="16"/>
+        </w:rPr>
+        <w:t>OPTIONS NON COMPRISES DANS LE TOTAL PRINCIPAL</w:t>
+      </w:r>
+    </w:p>
     <w:tbl>
       <w:tblPr>
-        <w:tblW w:type="dxa" w:w="10998"/>
+        <w:tblW w:type="auto" w:w="0"/>
         <w:jc w:val="center"/>
         <w:tblLayout w:type="fixed"/>
         <w:tblLook w:firstColumn="1" w:firstRow="1" w:lastColumn="0" w:lastRow="0" w:noHBand="0" w:noVBand="1" w:val="04A0"/>
       </w:tblPr>
       <w:tblGrid>
-        <w:gridCol w:w="567"/>
-        <w:gridCol w:w="5216"/>
-        <w:gridCol w:w="1134"/>
-        <w:gridCol w:w="1417"/>
-        <w:gridCol w:w="1077"/>
-        <w:gridCol w:w="1587"/>
+        <w:gridCol w:w="1833"/>
+        <w:gridCol w:w="1833"/>
+        <w:gridCol w:w="1833"/>
+        <w:gridCol w:w="1833"/>
+        <w:gridCol w:w="1833"/>
+        <w:gridCol w:w="1833"/>
       </w:tblGrid>
       <w:tr>
         <w:trPr>
@@ -1111,7 +1127,7 @@
     </w:tbl>
     <w:tbl>
       <w:tblPr>
-        <w:tblW w:type="dxa" w:w="10886"/>
+        <w:tblW w:type="auto" w:w="0"/>
         <w:jc w:val="center"/>
         <w:tblLayout w:type="fixed"/>
         <w:tblLook w:firstColumn="1" w:firstRow="1" w:lastColumn="0" w:lastRow="0" w:noHBand="0" w:noVBand="1" w:val="04A0"/>
@@ -1125,14 +1141,14 @@
         </w:tblBorders>
       </w:tblPr>
       <w:tblGrid>
-        <w:gridCol w:w="6314"/>
-        <w:gridCol w:w="4572"/>
+        <w:gridCol w:w="5499"/>
+        <w:gridCol w:w="5499"/>
       </w:tblGrid>
       <w:tr>
         <w:trPr/>
         <w:tc>
           <w:tcPr>
-            <w:tcW w:type="dxa" w:w="6314"/>
+            <w:tcW w:type="dxa" w:w="5443"/>
             <w:tcMar>
               <w:top w:w="80" w:type="dxa"/>
               <w:start w:w="0" w:type="dxa"/>
@@ -1296,7 +1312,7 @@
         </w:tc>
         <w:tc>
           <w:tcPr>
-            <w:tcW w:type="dxa" w:w="4572"/>
+            <w:tcW w:type="dxa" w:w="5443"/>
             <w:tcMar>
               <w:top w:w="80" w:type="dxa"/>
               <w:start w:w="0" w:type="dxa"/>
@@ -1638,14 +1654,6 @@
               <w:spacing w:after="0"/>
             </w:pPr>
           </w:p>
-        </w:tc>
-      </w:tr>
-      <w:tr>
-        <w:tc>
-          <w:tcPr>
-            <w:tcW w:type="dxa" w:w="10886"/>
-            <w:gridSpan w:val="2"/>
-          </w:tcPr>
           <w:p>
             <w:pPr>
               <w:spacing w:before="60" w:after="20" w:line="240" w:lineRule="auto"/>
@@ -2226,7 +2234,7 @@
       </w:r>
     </w:p>
     <w:sectPr>
-      <w:footerReference w:type="default" ns5:id="rId10"/>
+      <w:footerReference w:type="default" r:id="rId10"/>
       <w:pgSz w:w="11906" w:h="16838"/>
       <w:pgMar w:top="510" w:right="454" w:bottom="737" w:left="454" w:header="227" w:footer="283" w:gutter="0"/>
       <w:cols w:space="720"/>

</xml_diff>